<commit_message>
docs(paper-e): submitted to AAIR on 2026-10-22
Records the submission, the cover letter as sent by the author, the
similarity report (1%) and the form fields.

Co-Authored-By: Claude Opus 5.5 <noreply@anthropic.com>
</commit_message>
<xml_diff>
--- a/docs/reports/paper_e/aair_journal/submission/paper_e_aair_cover_letter.docx
+++ b/docs/reports/paper_e/aair_journal/submission/paper_e_aair_cover_letter.docx
@@ -73,7 +73,21 @@
           <w:rFonts w:ascii="Calibri" w:hAnsi="Calibri" w:cs="Calibri"/>
           <w:lang w:val="en-US"/>
         </w:rPr>
-        <w:t xml:space="preserve">With the submission of this manuscript I </w:t>
+        <w:t xml:space="preserve">With the submission of this </w:t>
+      </w:r>
+      <w:r>
+        <w:rPr>
+          <w:rFonts w:ascii="Calibri" w:hAnsi="Calibri" w:cs="Calibri"/>
+          <w:lang w:val="en-US"/>
+        </w:rPr>
+        <w:t>manuscript,</w:t>
+      </w:r>
+      <w:r>
+        <w:rPr>
+          <w:rFonts w:ascii="Calibri" w:hAnsi="Calibri" w:cs="Calibri"/>
+          <w:lang w:val="en-US"/>
+        </w:rPr>
+        <w:t xml:space="preserve"> I </w:t>
       </w:r>
       <w:r>
         <w:rPr>
@@ -164,14 +178,14 @@
           <w:rFonts w:ascii="Calibri" w:hAnsi="Calibri" w:cs="Calibri"/>
           <w:lang w:val="en-US"/>
         </w:rPr>
+        <w:t>,</w:t>
+      </w:r>
+      <w:r>
+        <w:rPr>
+          <w:rFonts w:ascii="Calibri" w:hAnsi="Calibri" w:cs="Calibri"/>
+          <w:lang w:val="en-US"/>
+        </w:rPr>
         <w:t xml:space="preserve"> </w:t>
-      </w:r>
-      <w:r>
-        <w:rPr>
-          <w:rFonts w:ascii="Calibri" w:hAnsi="Calibri" w:cs="Calibri"/>
-          <w:lang w:val="en-US"/>
-        </w:rPr>
-        <w:t xml:space="preserve">, </w:t>
       </w:r>
       <w:r>
         <w:rPr>
@@ -238,6 +252,12 @@
           <w:numId w:val="1"/>
         </w:numPr>
         <w:ind w:left="284"/>
+        <w:jc w:val="both"/>
+        <w:rPr>
+          <w:lang w:val="en-US"/>
+        </w:rPr>
+      </w:pPr>
+      <w:r>
         <w:rPr>
           <w:rFonts w:ascii="Calibri" w:hAnsi="Calibri" w:cs="Calibri"/>
           <w:color w:val="000000"/>
@@ -245,15 +265,6 @@
           <w:szCs w:val="24"/>
           <w:lang w:val="en-US"/>
         </w:rPr>
-      </w:pPr>
-      <w:r>
-        <w:rPr>
-          <w:rFonts w:ascii="Calibri" w:hAnsi="Calibri" w:cs="Calibri"/>
-          <w:color w:val="000000"/>
-          <w:sz w:val="24"/>
-          <w:szCs w:val="24"/>
-          <w:lang w:val="en-US"/>
-        </w:rPr>
         <w:t>Any manuscript of the author and/or coauthors have not been submitted or processed for last 12 months in the Communications.</w:t>
       </w:r>
     </w:p>
@@ -265,6 +276,12 @@
           <w:lang w:val="en-US"/>
         </w:rPr>
       </w:pPr>
+      <w:r>
+        <w:rPr>
+          <w:lang w:val="en-US"/>
+        </w:rPr>
+        <w:t>This study measures, at the level of the single prediction, how much SHAP and LIME, the two explanation methods most used for tabular models, agree on which features matter. It adds two references that earlier comparisons lack, the overlap between explanations of different instances and the agreement of each method with itself, and shows that the sign agreement of the two methods measures mostly the predicted class unless both are first expressed as the same quantity. It fits the journal's scope in machine learning and explainable artificial intelligence; the analysis plan was committed before the analysis, and every number is generated from public files.</w:t>
+      </w:r>
     </w:p>
     <w:p>
       <w:pPr>
@@ -274,12 +291,6 @@
           <w:lang w:val="en-US"/>
         </w:rPr>
       </w:pPr>
-      <w:r>
-        <w:rPr>
-          <w:lang w:val="en-US"/>
-        </w:rPr>
-        <w:t>On the third declaration: an earlier version of this manuscript was submitted to Computación y Sistemas and was withdrawn by the author, with the confirmation of its editor, before this submission, because peer review there would not have started within a year. The code, the run outputs and that earlier version are archived in a public repository (https://doi.org/10.5281/zenodo.23142429), which may show in the similarity report. The manuscript is not under consideration elsewhere.</w:t>
-      </w:r>
     </w:p>
     <w:p>
       <w:pPr>
@@ -289,6 +300,12 @@
           <w:lang w:val="en-US"/>
         </w:rPr>
       </w:pPr>
+      <w:r>
+        <w:rPr>
+          <w:lang w:val="en-US"/>
+        </w:rPr>
+        <w:t>The title in Turkish was translated by the author, who does not speak Turkish. The editorial office is kindly asked to correct it where needed.</w:t>
+      </w:r>
     </w:p>
     <w:p>
       <w:pPr>
@@ -298,12 +315,6 @@
           <w:lang w:val="en-US"/>
         </w:rPr>
       </w:pPr>
-      <w:r>
-        <w:rPr>
-          <w:lang w:val="en-US"/>
-        </w:rPr>
-        <w:t>This study measures, at the level of the single prediction, how much SHAP and LIME, the two explanation methods most used for tabular models, agree on which features matter. It adds two references that earlier comparisons lack, the overlap between explanations of different instances and the agreement of each method with itself, and shows that the sign agreement of the two methods measures mostly the predicted class unless both are first expressed as the same quantity. It fits the journal's scope in machine learning and explainable artificial intelligence; the analysis plan was committed before the analysis, and every number is generated from public files.</w:t>
-      </w:r>
     </w:p>
     <w:p>
       <w:pPr>
@@ -313,39 +324,6 @@
           <w:lang w:val="en-US"/>
         </w:rPr>
       </w:pPr>
-    </w:p>
-    <w:p>
-      <w:pPr>
-        <w:pStyle w:val="Default"/>
-        <w:jc w:val="both"/>
-        <w:rPr>
-          <w:lang w:val="en-US"/>
-        </w:rPr>
-      </w:pPr>
-      <w:r>
-        <w:rPr>
-          <w:lang w:val="en-US"/>
-        </w:rPr>
-        <w:t>The title in Turkish was translated by the author, who does not speak Turkish. The editorial office is kindly asked to correct it where needed.</w:t>
-      </w:r>
-    </w:p>
-    <w:p>
-      <w:pPr>
-        <w:pStyle w:val="Default"/>
-        <w:jc w:val="both"/>
-        <w:rPr>
-          <w:lang w:val="en-US"/>
-        </w:rPr>
-      </w:pPr>
-    </w:p>
-    <w:p>
-      <w:pPr>
-        <w:pStyle w:val="Default"/>
-        <w:jc w:val="both"/>
-        <w:rPr>
-          <w:lang w:val="en-US"/>
-        </w:rPr>
-      </w:pPr>
       <w:r>
         <w:rPr>
           <w:lang w:val="en-US"/>
@@ -356,178 +334,12 @@
     <w:p>
       <w:pPr>
         <w:pStyle w:val="Default"/>
-        <w:ind w:left="284"/>
-        <w:rPr>
-          <w:rFonts w:ascii="Calibri" w:hAnsi="Calibri" w:cs="Calibri"/>
-          <w:lang w:val="en-US"/>
-        </w:rPr>
-      </w:pPr>
-    </w:p>
-    <w:p>
-      <w:pPr>
-        <w:pStyle w:val="Default"/>
-        <w:rPr>
-          <w:rFonts w:ascii="Calibri" w:hAnsi="Calibri" w:cs="Calibri"/>
-          <w:lang w:val="en-US"/>
-        </w:rPr>
-      </w:pPr>
-    </w:p>
-    <w:p>
-      <w:pPr>
-        <w:pStyle w:val="Default"/>
-        <w:rPr>
-          <w:b/>
-          <w:bCs/>
-          <w:lang w:val="en-US"/>
-        </w:rPr>
-      </w:pPr>
-      <w:r>
-        <w:rPr>
-          <w:b/>
-          <w:bCs/>
-          <w:lang w:val="en-US"/>
-        </w:rPr>
-        <w:t xml:space="preserve">Here are the suggestions for potential reviewers for this submission. </w:t>
-      </w:r>
-    </w:p>
-    <w:p>
-      <w:pPr>
-        <w:pStyle w:val="Default"/>
-        <w:rPr>
-          <w:lang w:val="en-US"/>
-        </w:rPr>
-      </w:pPr>
-    </w:p>
-    <w:tbl>
-      <w:tblPr>
-        <w:tblW w:w="9197" w:type="dxa"/>
-        <w:tblBorders>
-          <w:top w:val="nil"/>
-          <w:left w:val="nil"/>
-          <w:bottom w:val="nil"/>
-          <w:right w:val="nil"/>
-        </w:tblBorders>
-        <w:tblLook w:val="0000" w:firstRow="0" w:lastRow="0" w:firstColumn="0" w:lastColumn="0" w:noHBand="0" w:noVBand="0"/>
-      </w:tblPr>
-      <w:tblGrid>
-        <w:gridCol w:w="2093"/>
-        <w:gridCol w:w="7104"/>
-      </w:tblGrid>
-      <w:tr>
-        <w:trPr>
-          <w:trHeight w:val="491"/>
-        </w:trPr>
-        <w:tc>
-          <w:tcPr>
-            <w:tcW w:w="2093" w:type="dxa"/>
-          </w:tcPr>
-          <w:p>
-            <w:pPr>
-              <w:pStyle w:val="Default"/>
-              <w:rPr>
-                <w:lang w:val="en-US"/>
-              </w:rPr>
-            </w:pPr>
-            <w:r>
-              <w:rPr>
-                <w:lang w:val="en-US"/>
-              </w:rPr>
-              <w:t xml:space="preserve">Name </w:t>
-            </w:r>
-          </w:p>
-        </w:tc>
-        <w:tc>
-          <w:tcPr>
-            <w:tcW w:w="7104" w:type="dxa"/>
-          </w:tcPr>
-          <w:p>
-            <w:pPr>
-              <w:pStyle w:val="Default"/>
-              <w:rPr>
-                <w:lang w:val="en-US"/>
-              </w:rPr>
-            </w:pPr>
-          </w:p>
-        </w:tc>
-      </w:tr>
-      <w:tr>
-        <w:trPr>
-          <w:trHeight w:val="491"/>
-        </w:trPr>
-        <w:tc>
-          <w:tcPr>
-            <w:tcW w:w="2093" w:type="dxa"/>
-          </w:tcPr>
-          <w:p>
-            <w:pPr>
-              <w:pStyle w:val="Default"/>
-              <w:rPr>
-                <w:lang w:val="en-US"/>
-              </w:rPr>
-            </w:pPr>
-            <w:r>
-              <w:rPr>
-                <w:lang w:val="en-US"/>
-              </w:rPr>
-              <w:lastRenderedPageBreak/>
-              <w:t xml:space="preserve">Institution </w:t>
-            </w:r>
-          </w:p>
-        </w:tc>
-        <w:tc>
-          <w:tcPr>
-            <w:tcW w:w="7104" w:type="dxa"/>
-          </w:tcPr>
-          <w:p>
-            <w:pPr>
-              <w:pStyle w:val="Default"/>
-              <w:rPr>
-                <w:lang w:val="en-US"/>
-              </w:rPr>
-            </w:pPr>
-          </w:p>
-        </w:tc>
-      </w:tr>
-      <w:tr>
-        <w:trPr>
-          <w:trHeight w:val="500"/>
-        </w:trPr>
-        <w:tc>
-          <w:tcPr>
-            <w:tcW w:w="2093" w:type="dxa"/>
-          </w:tcPr>
-          <w:p>
-            <w:pPr>
-              <w:pStyle w:val="Default"/>
-              <w:rPr>
-                <w:lang w:val="en-US"/>
-              </w:rPr>
-            </w:pPr>
-            <w:r>
-              <w:rPr>
-                <w:lang w:val="en-US"/>
-              </w:rPr>
-              <w:t xml:space="preserve">E-mail Address </w:t>
-            </w:r>
-          </w:p>
-        </w:tc>
-        <w:tc>
-          <w:tcPr>
-            <w:tcW w:w="7104" w:type="dxa"/>
-          </w:tcPr>
-          <w:p>
-            <w:pPr>
-              <w:pStyle w:val="Default"/>
-              <w:rPr>
-                <w:rFonts w:ascii="Arial" w:hAnsi="Arial" w:cs="Arial"/>
-                <w:color w:val="0462C1"/>
-                <w:lang w:val="en-US"/>
-              </w:rPr>
-            </w:pPr>
-          </w:p>
-        </w:tc>
-      </w:tr>
-    </w:tbl>
+        <w:rPr>
+          <w:rFonts w:ascii="Calibri" w:hAnsi="Calibri" w:cs="Calibri"/>
+          <w:lang w:val="en-US"/>
+        </w:rPr>
+      </w:pPr>
+    </w:p>
     <w:p>
       <w:pPr>
         <w:pStyle w:val="Default"/>
@@ -537,322 +349,73 @@
         </w:rPr>
       </w:pPr>
     </w:p>
-    <w:tbl>
-      <w:tblPr>
-        <w:tblW w:w="9218" w:type="dxa"/>
-        <w:tblBorders>
-          <w:top w:val="nil"/>
-          <w:left w:val="nil"/>
-          <w:bottom w:val="nil"/>
-          <w:right w:val="nil"/>
-        </w:tblBorders>
-        <w:tblLook w:val="0000" w:firstRow="0" w:lastRow="0" w:firstColumn="0" w:lastColumn="0" w:noHBand="0" w:noVBand="0"/>
-      </w:tblPr>
-      <w:tblGrid>
-        <w:gridCol w:w="2093"/>
-        <w:gridCol w:w="7125"/>
-      </w:tblGrid>
-      <w:tr>
-        <w:trPr>
-          <w:trHeight w:val="349"/>
-        </w:trPr>
-        <w:tc>
-          <w:tcPr>
-            <w:tcW w:w="2093" w:type="dxa"/>
-          </w:tcPr>
-          <w:p>
-            <w:pPr>
-              <w:pStyle w:val="Default"/>
-              <w:rPr>
-                <w:lang w:val="en-US"/>
-              </w:rPr>
-            </w:pPr>
-            <w:r>
-              <w:rPr>
-                <w:lang w:val="en-US"/>
-              </w:rPr>
-              <w:t xml:space="preserve">Name </w:t>
-            </w:r>
-          </w:p>
-        </w:tc>
-        <w:tc>
-          <w:tcPr>
-            <w:tcW w:w="7125" w:type="dxa"/>
-          </w:tcPr>
-          <w:p>
-            <w:pPr>
-              <w:pStyle w:val="Default"/>
-              <w:rPr>
-                <w:lang w:val="en-US"/>
-              </w:rPr>
-            </w:pPr>
-          </w:p>
-        </w:tc>
-      </w:tr>
-      <w:tr>
-        <w:trPr>
-          <w:trHeight w:val="359"/>
-        </w:trPr>
-        <w:tc>
-          <w:tcPr>
-            <w:tcW w:w="2093" w:type="dxa"/>
-          </w:tcPr>
-          <w:p>
-            <w:pPr>
-              <w:pStyle w:val="Default"/>
-              <w:rPr>
-                <w:lang w:val="en-US"/>
-              </w:rPr>
-            </w:pPr>
-            <w:r>
-              <w:rPr>
-                <w:lang w:val="en-US"/>
-              </w:rPr>
-              <w:t xml:space="preserve">Institution </w:t>
-            </w:r>
-          </w:p>
-        </w:tc>
-        <w:tc>
-          <w:tcPr>
-            <w:tcW w:w="7125" w:type="dxa"/>
-          </w:tcPr>
-          <w:p>
-            <w:pPr>
-              <w:pStyle w:val="Default"/>
-              <w:rPr>
-                <w:lang w:val="en-US"/>
-              </w:rPr>
-            </w:pPr>
-          </w:p>
-        </w:tc>
-      </w:tr>
-      <w:tr>
-        <w:trPr>
-          <w:trHeight w:val="356"/>
-        </w:trPr>
-        <w:tc>
-          <w:tcPr>
-            <w:tcW w:w="2093" w:type="dxa"/>
-          </w:tcPr>
-          <w:p>
-            <w:pPr>
-              <w:pStyle w:val="Default"/>
-              <w:rPr>
-                <w:lang w:val="en-US"/>
-              </w:rPr>
-            </w:pPr>
-            <w:r>
-              <w:rPr>
-                <w:lang w:val="en-US"/>
-              </w:rPr>
-              <w:t xml:space="preserve">E-mail Address </w:t>
-            </w:r>
-          </w:p>
-        </w:tc>
-        <w:tc>
-          <w:tcPr>
-            <w:tcW w:w="7125" w:type="dxa"/>
-          </w:tcPr>
-          <w:p>
-            <w:pPr>
-              <w:pStyle w:val="Default"/>
-              <w:rPr>
-                <w:rFonts w:ascii="Arial" w:hAnsi="Arial" w:cs="Arial"/>
-                <w:color w:val="0462C1"/>
-                <w:lang w:val="en-US"/>
-              </w:rPr>
-            </w:pPr>
-          </w:p>
-        </w:tc>
-      </w:tr>
-    </w:tbl>
-    <w:p>
-      <w:pPr>
-        <w:pStyle w:val="Default"/>
-        <w:rPr>
-          <w:color w:val="auto"/>
-          <w:lang w:val="en-US"/>
-        </w:rPr>
-      </w:pPr>
-    </w:p>
-    <w:tbl>
-      <w:tblPr>
-        <w:tblW w:w="9243" w:type="dxa"/>
-        <w:tblBorders>
-          <w:top w:val="nil"/>
-          <w:left w:val="nil"/>
-          <w:bottom w:val="nil"/>
-          <w:right w:val="nil"/>
-        </w:tblBorders>
-        <w:tblLook w:val="0000" w:firstRow="0" w:lastRow="0" w:firstColumn="0" w:lastColumn="0" w:noHBand="0" w:noVBand="0"/>
-      </w:tblPr>
-      <w:tblGrid>
-        <w:gridCol w:w="2093"/>
-        <w:gridCol w:w="7150"/>
-      </w:tblGrid>
-      <w:tr>
-        <w:trPr>
-          <w:trHeight w:val="342"/>
-        </w:trPr>
-        <w:tc>
-          <w:tcPr>
-            <w:tcW w:w="2093" w:type="dxa"/>
-          </w:tcPr>
-          <w:p>
-            <w:pPr>
-              <w:pStyle w:val="Default"/>
-              <w:rPr>
-                <w:lang w:val="en-US"/>
-              </w:rPr>
-            </w:pPr>
-            <w:r>
-              <w:rPr>
-                <w:lang w:val="en-US"/>
-              </w:rPr>
-              <w:t xml:space="preserve">Name </w:t>
-            </w:r>
-          </w:p>
-        </w:tc>
-        <w:tc>
-          <w:tcPr>
-            <w:tcW w:w="7150" w:type="dxa"/>
-          </w:tcPr>
-          <w:p>
-            <w:pPr>
-              <w:pStyle w:val="Default"/>
-              <w:rPr>
-                <w:lang w:val="en-US"/>
-              </w:rPr>
-            </w:pPr>
-          </w:p>
-        </w:tc>
-      </w:tr>
-      <w:tr>
-        <w:trPr>
-          <w:trHeight w:val="342"/>
-        </w:trPr>
-        <w:tc>
-          <w:tcPr>
-            <w:tcW w:w="2093" w:type="dxa"/>
-          </w:tcPr>
-          <w:p>
-            <w:pPr>
-              <w:pStyle w:val="Default"/>
-              <w:rPr>
-                <w:lang w:val="en-US"/>
-              </w:rPr>
-            </w:pPr>
-            <w:r>
-              <w:rPr>
-                <w:lang w:val="en-US"/>
-              </w:rPr>
-              <w:t xml:space="preserve">Institution </w:t>
-            </w:r>
-          </w:p>
-        </w:tc>
-        <w:tc>
-          <w:tcPr>
-            <w:tcW w:w="7150" w:type="dxa"/>
-          </w:tcPr>
-          <w:p>
-            <w:pPr>
-              <w:pStyle w:val="Default"/>
-              <w:rPr>
-                <w:lang w:val="en-US"/>
-              </w:rPr>
-            </w:pPr>
-          </w:p>
-        </w:tc>
-      </w:tr>
-      <w:tr>
-        <w:trPr>
-          <w:trHeight w:val="348"/>
-        </w:trPr>
-        <w:tc>
-          <w:tcPr>
-            <w:tcW w:w="2093" w:type="dxa"/>
-            <w:tcBorders>
-              <w:bottom w:val="nil"/>
-            </w:tcBorders>
-          </w:tcPr>
-          <w:p>
-            <w:pPr>
-              <w:pStyle w:val="Default"/>
-              <w:rPr>
-                <w:lang w:val="en-US"/>
-              </w:rPr>
-            </w:pPr>
-            <w:r>
-              <w:rPr>
-                <w:lang w:val="en-US"/>
-              </w:rPr>
-              <w:t xml:space="preserve">E-mail Address </w:t>
-            </w:r>
-          </w:p>
-        </w:tc>
-        <w:tc>
-          <w:tcPr>
-            <w:tcW w:w="7150" w:type="dxa"/>
-            <w:tcBorders>
-              <w:bottom w:val="nil"/>
-            </w:tcBorders>
-          </w:tcPr>
-          <w:p>
-            <w:pPr>
-              <w:pStyle w:val="Default"/>
-              <w:rPr>
-                <w:rFonts w:ascii="Arial" w:hAnsi="Arial" w:cs="Arial"/>
-                <w:color w:val="0462C1"/>
-                <w:lang w:val="en-US"/>
-              </w:rPr>
-            </w:pPr>
-          </w:p>
-        </w:tc>
-      </w:tr>
-    </w:tbl>
-    <w:p>
-      <w:pPr>
-        <w:pStyle w:val="Default"/>
-        <w:rPr>
-          <w:color w:val="auto"/>
-          <w:lang w:val="en-US"/>
-        </w:rPr>
-      </w:pPr>
-    </w:p>
-    <w:p>
-      <w:pPr>
-        <w:pStyle w:val="Default"/>
-        <w:rPr>
-          <w:lang w:val="en-US"/>
-        </w:rPr>
-      </w:pPr>
-    </w:p>
-    <w:p>
-      <w:pPr>
-        <w:pStyle w:val="Default"/>
-        <w:rPr>
-          <w:lang w:val="en-US"/>
-        </w:rPr>
-      </w:pPr>
-      <w:r>
-        <w:rPr>
-          <w:lang w:val="en-US"/>
-        </w:rPr>
-        <w:t>Corresponding author of the manuscript: Jonathan Herrera-Vásquez, Universidad Americana de Europa (UNADE), Department of Computer Science, Cancún, Quintana Roo, Mexico; jonnabio@gmail.com; ORCID 0000-0002-7149-6635</w:t>
-      </w:r>
-    </w:p>
-    <w:p>
-      <w:pPr>
-        <w:pStyle w:val="Default"/>
-        <w:rPr>
-          <w:lang w:val="en-US"/>
-        </w:rPr>
-      </w:pPr>
-      <w:r>
-        <w:rPr>
-          <w:lang w:val="en-US"/>
-        </w:rPr>
-        <w:t>Submission Date: [Month Day, Year]</w:t>
+    <w:p>
+      <w:pPr>
+        <w:pStyle w:val="Default"/>
+        <w:rPr>
+          <w:lang w:val="en-US"/>
+        </w:rPr>
+      </w:pPr>
+    </w:p>
+    <w:p>
+      <w:pPr>
+        <w:pStyle w:val="Default"/>
+        <w:rPr>
+          <w:lang w:val="en-US"/>
+        </w:rPr>
+      </w:pPr>
+      <w:r>
+        <w:rPr>
+          <w:lang w:val="en-US"/>
+        </w:rPr>
+        <w:t xml:space="preserve">Corresponding author of the manuscript: Jonathan Herrera-Vásquez, Universidad Americana de Europa (UNADE), Department of Computer Science, Cancún, </w:t>
+      </w:r>
+      <w:proofErr w:type="spellStart"/>
+      <w:r>
+        <w:rPr>
+          <w:lang w:val="en-US"/>
+        </w:rPr>
+        <w:t>Quintana</w:t>
+      </w:r>
+      <w:proofErr w:type="spellEnd"/>
+      <w:r>
+        <w:rPr>
+          <w:lang w:val="en-US"/>
+        </w:rPr>
+        <w:t xml:space="preserve"> Roo, Mexico; jonnabio@gmail.com; ORCID 0000-0002-7149-6635</w:t>
+      </w:r>
+    </w:p>
+    <w:p>
+      <w:pPr>
+        <w:pStyle w:val="Default"/>
+        <w:rPr>
+          <w:lang w:val="en-US"/>
+        </w:rPr>
+      </w:pPr>
+      <w:r>
+        <w:rPr>
+          <w:lang w:val="en-US"/>
+        </w:rPr>
+        <w:t xml:space="preserve">Submission Date: </w:t>
+      </w:r>
+      <w:r>
+        <w:rPr>
+          <w:lang w:val="en-US"/>
+        </w:rPr>
+        <w:t>Oct 22</w:t>
+      </w:r>
+      <w:r>
+        <w:rPr>
+          <w:vertAlign w:val="superscript"/>
+          <w:lang w:val="en-US"/>
+        </w:rPr>
+        <w:t>nd</w:t>
+      </w:r>
+      <w:r>
+        <w:rPr>
+          <w:lang w:val="en-US"/>
+        </w:rPr>
+        <w:t>, 2026.</w:t>
       </w:r>
     </w:p>
     <w:p>

</xml_diff>